<commit_message>
Glycémie au laboratoire du centre, et projet aligné sur le protocole corrigé
Réalisme demandé : dans les centres de santé rwandais, le glucomètre est
au laboratoire ou à la consultation des maladies chroniques, pas en
salle de CPN. Grilles d'observation, entretiens, données de routine,
mémos et chapitre 5 réécrits en conséquence : aucun glucomètre en salle de
CPN ; glycémie réalisable sur bon de la CPN dans 5 centres, réservée à la
consultation MNT dans 3, impossible dans 7, absente dans le centre neuf.
Nouveau code inductif B8 (glycémie hors de la CPN).

Protocole corrigé : double codage de 3 entretiens par un pair extérieur,
recodage de 3 entretiens après quatre semaines, vérification auprès de 4
participants volontaires ; positionnalité fondée sur le protocole.
Chiffres du LISEZ-MOI et du guide mis à jour.

Co-Authored-By: Claude Opus 5.5 <noreply@anthropic.com>
Claude-Session: https://claude.ai/code/session_01HxwPseJn9EZbm4HRSeCoVh
</commit_message>
<xml_diff>
--- a/memoire-ngoma/livrables/2_Transcriptions_verbatim_SIMULATION.docx
+++ b/memoire-ngoma/livrables/2_Transcriptions_verbatim_SIMULATION.docx
@@ -1450,7 +1450,7 @@
           <w:sz w:val="20"/>
           <w:szCs w:val="20"/>
         </w:rPr>
-        <w:t xml:space="preserve">La tension, c'est aux constantes, au tout début. C'est systématique, ça fait partie des constantes comme le poids. Le sucre… (silence) le sucre c'est différent. On a un glucomètre, mais les bandelettes, on en a douze en ce moment. Douze. Alors on ne peut pas faire à tout le monde. On le fait quand il y a quelque chose qui nous inquiète : une femme corpulente, une femme qui a déjà eu un gros bébé, une femme dont la mère est diabétique, ou si la bandelette urinaire montre du sucre. Sinon non.</w:t>
+        <w:t xml:space="preserve">La tension, c'est aux constantes, au tout début. C'est systématique, ça fait partie des constantes comme le poids. Le sucre… (silence) le sucre c'est différent. Le glucomètre est au laboratoire, pas chez nous : j'écris un bon, et la femme va faire la queue au labo. Et les bandelettes, le labo en a douze en ce moment. Douze. Alors on ne peut pas faire à tout le monde. On le fait quand il y a quelque chose qui nous inquiète : une femme corpulente, une femme qui a déjà eu un gros bébé, une femme dont la mère est diabétique, ou si la bandelette urinaire montre du sucre. Sinon non.</w:t>
       </w:r>
     </w:p>
     <w:p>
@@ -1971,7 +1971,7 @@
           <w:sz w:val="20"/>
           <w:szCs w:val="20"/>
         </w:rPr>
-        <w:t xml:space="preserve">En juin et juillet on n'a eu aucune bandelette de glycémie pendant six semaines. Six semaines. Pendant ce temps-là, une femme corpulente avec des antécédents, je ne pouvais rien faire, je l'envoyais à l'hôpital pour une glycémie — et beaucoup n'y allaient pas, parce que c'est un déplacement, c'est un jour de travail perdu. Donc concrètement, pendant six semaines, le dépistage du diabète n'existait pas ici.</w:t>
+        <w:t xml:space="preserve">En juin et juillet le laboratoire n'a eu aucune bandelette de glycémie pendant six semaines. Six semaines. Pendant ce temps-là, une femme corpulente avec des antécédents, je ne pouvais rien faire, je l'envoyais à l'hôpital pour une glycémie — et beaucoup n'y allaient pas, parce que c'est un déplacement, c'est un jour de travail perdu. Donc concrètement, pendant six semaines, le dépistage du diabète n'existait pas ici.</w:t>
       </w:r>
     </w:p>
     <w:p>
@@ -2394,7 +2394,7 @@
           <w:sz w:val="20"/>
           <w:szCs w:val="20"/>
         </w:rPr>
-        <w:t xml:space="preserve">Les bandelettes. Un approvisionnement régulier en bandelettes de glycémie, et un glucomètre de réserve. Pourquoi celle-là ? Parce que pour la tension, nous savons faire et nous avons l'appareil : ce qui manque, c'est la moitié du dépistage. Aujourd'hui je fais la moitié du travail et j'appelle ça un dépistage.</w:t>
+        <w:t xml:space="preserve">Les bandelettes. Un approvisionnement régulier en bandelettes de glycémie, avec une part réservée à la CPN au laboratoire — aujourd'hui, la consultation des malades chroniques passe avant nous. Pourquoi celle-là ? Parce que pour la tension, nous savons faire et nous avons l'appareil : ce qui manque, c'est la moitié du dépistage. Aujourd'hui je fais la moitié du travail et j'appelle ça un dépistage.</w:t>
       </w:r>
     </w:p>
     <w:p>
@@ -3455,7 +3455,7 @@
           <w:sz w:val="20"/>
           <w:szCs w:val="20"/>
         </w:rPr>
-        <w:t xml:space="preserve">La tension est dans les constantes, donc au début et de façon systématique — chez nous vraiment systématique, parce qu'il y a une salle pour ça et une personne pour ça. Le sucre, non. On a le glucomètre, mais les bandelettes sont comptées. Nous en avons douze ce mois. Donc la recherche du sucre, elle n'est pas dans le déroulement : elle est en dehors, elle dépend de moi, de mon jugement, de ce que je trouve à la bandelette urinaire. Et ça, c'est un problème, parce que ce qui dépend du jugement de chacune n'est pas égal d'une femme à l'autre.</w:t>
+        <w:t xml:space="preserve">La tension est dans les constantes, donc au début et de façon systématique — chez nous vraiment systématique, parce qu'il y a une salle pour ça et une personne pour ça. Le sucre, non. Le glucomètre est au laboratoire, et les bandelettes sont comptées : le labo en a douze ce mois, et il les garde d'abord pour les malades chroniques. Donc la recherche du sucre, elle n'est pas dans le déroulement : elle est en dehors, elle dépend de moi, de mon jugement, de ce que je trouve à la bandelette urinaire. Et ça, c'est un problème, parce que ce qui dépend du jugement de chacune n'est pas égal d'une femme à l'autre.</w:t>
       </w:r>
     </w:p>
     <w:p>
@@ -3926,7 +3926,7 @@
           <w:sz w:val="20"/>
           <w:szCs w:val="20"/>
         </w:rPr>
-        <w:t xml:space="preserve">Pendant la rupture de bandelettes, il y a eu une femme : trente-huit ans, quatrième grossesse, très corpulente, un enfant précédent de plus de quatre kilos. Le cas typique. Je n'avais rien. Je l'ai envoyée faire une glycémie à l'hôpital. Elle est revenue au rendez-vous suivant sans l'avoir faite — pas d'argent pour le déplacement ce jour-là, et elle avait un autre problème plus urgent. Donc je n'ai jamais su. Elle a accouché, tout s'est bien passé, mais je n'ai jamais su.</w:t>
+        <w:t xml:space="preserve">Pendant la rupture de bandelettes, il y a eu une femme : trente-huit ans, quatrième grossesse, très corpulente, un enfant précédent de plus de quatre kilos. Le cas typique. Le laboratoire n'avait plus rien. Je l'ai envoyée faire une glycémie à l'hôpital. Elle est revenue au rendez-vous suivant sans l'avoir faite — pas d'argent pour le déplacement ce jour-là, et elle avait un autre problème plus urgent. Donc je n'ai jamais su. Elle a accouché, tout s'est bien passé, mais je n'ai jamais su.</w:t>
       </w:r>
     </w:p>
     <w:p>
@@ -5360,7 +5360,7 @@
           <w:sz w:val="20"/>
           <w:szCs w:val="20"/>
         </w:rPr>
-        <w:t xml:space="preserve">La tension, c'est avec le poids, au début. Le sucre… (long silence) nous n'avons pas d'appareil. Il n'y a pas de glucomètre ici. Alors le sucre, je ne le fais pas.</w:t>
+        <w:t xml:space="preserve">La tension, c'est avec le poids, au début. Le sucre… (long silence) il y a un glucomètre au laboratoire, mais il sert pour la consultation des malades chroniques. Je n'ai jamais envoyé une femme enceinte faire le sucre là-bas. Alors le sucre, je ne le fais pas.</w:t>
       </w:r>
     </w:p>
     <w:p>
@@ -5410,7 +5410,7 @@
           <w:sz w:val="20"/>
           <w:szCs w:val="20"/>
         </w:rPr>
-        <w:t xml:space="preserve">Je n'ai jamais fait de test de sucre depuis que je travaille ici. Jamais. Si je pense qu'il faut le faire, j'écris sur le carnet d'aller à l'hôpital. Mais je ne sais pas si elles y vont. À l'école on nous a montré comment faire, avec l'appareil, mais ici il n'y en a pas, donc… (silence) j'ai un peu oublié, pour être honnête.</w:t>
+        <w:t xml:space="preserve">Je n'ai jamais fait de test de sucre depuis que je travaille ici. Jamais. Si je pense qu'il faut le faire, j'écris sur le carnet d'aller à l'hôpital. Mais je ne sais pas si elles y vont. À l'école on nous a montré comment faire, avec l'appareil, mais ici on ne me l'a jamais demandé, et le laboratoire ne le fait pas pour nous, donc… (silence) j'ai un peu oublié, pour être honnête.</w:t>
       </w:r>
     </w:p>
     <w:p>
@@ -5855,7 +5855,7 @@
           <w:sz w:val="20"/>
           <w:szCs w:val="20"/>
         </w:rPr>
-        <w:t xml:space="preserve">La tension, c'est une chose normale du travail, comme le poids. Le sucre, ce n'est pas dans mon travail, puisque je ne peux pas le faire. Si je compare avec le reste… le plus important pour moi c'est de voir si le bébé va bien, et si la femme n'a pas le paludisme ou l'anémie. C'est ça que je regarde d'abord.</w:t>
+        <w:t xml:space="preserve">La tension, c'est une chose normale du travail, comme le poids. Le sucre, ce n'est pas dans mon travail : c'est le laboratoire, et la consultation des chroniques. Si je compare avec le reste… le plus important pour moi c'est de voir si le bébé va bien, et si la femme n'a pas le paludisme ou l'anémie. C'est ça que je regarde d'abord.</w:t>
       </w:r>
     </w:p>
     <w:p>
@@ -6404,7 +6404,7 @@
           <w:sz w:val="20"/>
           <w:szCs w:val="20"/>
         </w:rPr>
-        <w:t xml:space="preserve">Une formation. Parce que le matériel, même si on nous donne un glucomètre, moi je ne saurais pas bien quand l'utiliser ni quoi dire à la femme après. Donc d'abord savoir, et après avoir.</w:t>
+        <w:t xml:space="preserve">Une formation. Parce que le matériel, même si le laboratoire acceptait de faire le sucre pour nos femmes, moi je ne saurais pas bien quand le demander ni quoi dire à la femme après. Donc d'abord savoir, et après avoir.</w:t>
       </w:r>
     </w:p>
     <w:p>
@@ -7465,7 +7465,7 @@
           <w:sz w:val="20"/>
           <w:szCs w:val="20"/>
         </w:rPr>
-        <w:t xml:space="preserve">La tension est au début, avec le poids. Quand nous sommes deux et que personne n'est appelé ailleurs, je la prends à tout le monde. Mais nous ne sommes pas toujours deux, et il n'y a qu'un tensiomètre dans le centre. Le sucre, il n'y a pas d'appareil, donc non.</w:t>
+        <w:t xml:space="preserve">La tension est au début, avec le poids. Quand nous sommes deux et que personne n'est appelé ailleurs, je la prends à tout le monde. Mais nous ne sommes pas toujours deux, et il n'y a qu'un tensiomètre dans le centre. Le sucre, l'appareil est au labo, pour les malades chroniques. Nous, on ne l'a pas, donc non.</w:t>
       </w:r>
     </w:p>
     <w:p>
@@ -9370,7 +9370,7 @@
           <w:sz w:val="20"/>
           <w:szCs w:val="20"/>
         </w:rPr>
-        <w:t xml:space="preserve">Tous les jours. Chaque femme qui entre ici a sa tension prise et inscrite. Pour le sucre, c'est autre chose : nous n'avons pas de glucomètre. Ça, c'est un manque du niveau supérieur, ce n'est pas nous.</w:t>
+        <w:t xml:space="preserve">Tous les jours. Chaque femme qui entre ici a sa tension prise et inscrite. Pour le sucre, c'est autre chose : le glucomètre du laboratoire n'a plus de bandelettes. Ça, c'est un manque du niveau supérieur, ce n'est pas nous.</w:t>
       </w:r>
     </w:p>
     <w:p>
@@ -9891,7 +9891,7 @@
           <w:sz w:val="20"/>
           <w:szCs w:val="20"/>
         </w:rPr>
-        <w:t xml:space="preserve">(silence) Il y a la question des bandelettes de sucre : nous n'en avons pas reçu depuis plusieurs mois, peut-être quatre. Donc le sucre, nous ne pouvons pas. Pour la tension, nous avons l'appareil.</w:t>
+        <w:t xml:space="preserve">(silence) Il y a la question des bandelettes de sucre : le laboratoire n'en a pas reçu depuis plusieurs mois, peut-être quatre. Le glucomètre est là, mais sans bandelettes il ne sert à rien. Donc le sucre, nous ne pouvons pas. Pour la tension, nous avons l'appareil.</w:t>
       </w:r>
     </w:p>
     <w:p>
@@ -10236,7 +10236,7 @@
           <w:sz w:val="20"/>
           <w:szCs w:val="20"/>
         </w:rPr>
-        <w:t xml:space="preserve">Moi je n'ai pas eu de formation sur ces maladies, non. J'ai l'expérience. Pour la tension, on n'a pas besoin de formation, c'est le métier de base. Pour le diabète de la grossesse, je reconnais que je ne connais pas bien ; mais comme nous n'avons pas l'appareil, la question ne se pose pas.</w:t>
+        <w:t xml:space="preserve">Moi je n'ai pas eu de formation sur ces maladies, non. J'ai l'expérience. Pour la tension, on n'a pas besoin de formation, c'est le métier de base. Pour le diabète de la grossesse, je reconnais que je ne connais pas bien ; mais comme le laboratoire n'a pas de bandelettes, la question ne se pose pas.</w:t>
       </w:r>
     </w:p>
     <w:p>
@@ -10314,7 +10314,7 @@
           <w:sz w:val="20"/>
           <w:szCs w:val="20"/>
         </w:rPr>
-        <w:t xml:space="preserve">Le glucomètre et les bandelettes. Parce que c'est la seule chose qui manque complètement. Le reste, nous l'avons et nous le faisons.</w:t>
+        <w:t xml:space="preserve">Les bandelettes pour le glucomètre du laboratoire. Parce que c'est la seule chose qui manque complètement. Le reste, nous l'avons et nous le faisons.</w:t>
       </w:r>
     </w:p>
     <w:p>
@@ -11375,7 +11375,7 @@
           <w:sz w:val="20"/>
           <w:szCs w:val="20"/>
         </w:rPr>
-        <w:t xml:space="preserve">Normalement la tension est au début, avec les constantes. Dans les faits, elle est prise quand l'appareil est disponible. Le sucre, il n'y a pas d'appareil du tout, et pas de bandelettes depuis que je suis ici — enfin, depuis plusieurs mois. À la formation on m'a expliqué comment dépister le diabète gestationnel, les critères, quand faire la glycémie. Je sais le faire. Je ne l'ai jamais fait ici.</w:t>
+        <w:t xml:space="preserve">Normalement la tension est au début, avec les constantes. Dans les faits, elle est prise quand l'appareil est disponible. Le sucre, il faut passer par le laboratoire, et le laboratoire n'a pas de bandelettes depuis plusieurs mois. À la formation on m'a expliqué comment dépister le diabète gestationnel, les critères, quand faire la glycémie. Je sais le faire. Je ne l'ai jamais fait ici.</w:t>
       </w:r>
     </w:p>
     <w:p>
@@ -12269,7 +12269,7 @@
           <w:sz w:val="20"/>
           <w:szCs w:val="20"/>
         </w:rPr>
-        <w:t xml:space="preserve">Un tensiomètre qui marche, à nous, qui ne sorte pas de la salle de CPN. Pourquoi celui-là plutôt que le glucomètre ? Parce que la tension, c'est ce qui tue ici, et parce que nous sommes à un appareil près de faire correctement la moitié du travail. Le glucomètre viendra après.</w:t>
+        <w:t xml:space="preserve">Un tensiomètre qui marche, à nous, qui ne sorte pas de la salle de CPN. Pourquoi celui-là plutôt que des bandelettes pour le labo ? Parce que la tension, c'est ce qui tue ici, et parce que nous sommes à un appareil près de faire correctement la moitié du travail. Les bandelettes viendront après.</w:t>
       </w:r>
     </w:p>
     <w:p>
@@ -13330,7 +13330,7 @@
           <w:sz w:val="20"/>
           <w:szCs w:val="20"/>
         </w:rPr>
-        <w:t xml:space="preserve">La tension est aux constantes, systématique. C'est le point fort de notre organisation : quelqu'un est affecté à cela. Le sucre — nous avons un glucomètre en état, mais nos bandelettes sont périmées depuis mars. Donc dans les faits, depuis six mois, aucune glycémie n'est faite ici. On envoie au laboratoire de l'hôpital, qui est à quinze minutes — ça, c'est notre avantage par rapport aux centres éloignés. Mais même à quinze minutes, une partie des femmes n'y va pas.</w:t>
+        <w:t xml:space="preserve">La tension est aux constantes, systématique. C'est le point fort de notre organisation : quelqu'un est affecté à cela. Le sucre — le glucomètre du laboratoire est en état, mais les bandelettes du labo sont périmées depuis mars. La consultation des chroniques a sa petite réserve, mais elle n'est pas pour nous. Donc dans les faits, depuis six mois, aucune glycémie n'est faite ici pour une femme enceinte. On envoie au laboratoire de l'hôpital, qui est à quinze minutes — ça, c'est notre avantage par rapport aux centres éloignés. Mais même à quinze minutes, une partie des femmes n'y va pas.</w:t>
       </w:r>
     </w:p>
     <w:p>
@@ -15235,7 +15235,7 @@
           <w:sz w:val="20"/>
           <w:szCs w:val="20"/>
         </w:rPr>
-        <w:t xml:space="preserve">La tension c'est moi qui la prends, au début, à toutes les femmes. C'est mon poste. Le sucre, on ne le fait pas : les bandelettes sont périmées. Et de toute façon ce n'est pas moi qui décide de le faire ou pas, c'est la sage-femme.</w:t>
+        <w:t xml:space="preserve">La tension c'est moi qui la prends, au début, à toutes les femmes. C'est mon poste. Le sucre, on ne le fait pas : c'est au labo, et les bandelettes du labo sont périmées. Et de toute façon ce n'est pas moi qui décide de le faire ou pas, c'est la sage-femme.</w:t>
       </w:r>
     </w:p>
     <w:p>
@@ -17040,7 +17040,7 @@
           <w:sz w:val="20"/>
           <w:szCs w:val="20"/>
         </w:rPr>
-        <w:t xml:space="preserve">La tension est aux constantes. Nous y tenons, et je vérifie le registre chaque semaine pour voir si la colonne est remplie — c'est une consigne que j'ai donnée moi-même. Pour le sucre, nous avons un glucomètre, mais il est en panne : il affiche une erreur. Et nous n'avons pas de bandelettes. Donc le dépistage du diabète n'existe pas ici, depuis longtemps.</w:t>
+        <w:t xml:space="preserve">La tension est aux constantes. Nous y tenons, et je vérifie le registre chaque semaine pour voir si la colonne est remplie — c'est une consigne que j'ai donnée moi-même. Pour le sucre, le glucomètre du laboratoire est en panne : il affiche une erreur. Et nous n'avons pas de bandelettes. Donc le dépistage du diabète n'existe pas ici, depuis longtemps.</w:t>
       </w:r>
     </w:p>
     <w:p>
@@ -19045,7 +19045,7 @@
           <w:sz w:val="20"/>
           <w:szCs w:val="20"/>
         </w:rPr>
-        <w:t xml:space="preserve">La tension est au début, avec le poids. Ici on la prend à toutes — la titulaire y tient beaucoup, elle vérifie le registre. Le sucre, non : notre appareil ne marche pas. Il est sur l'étagère. Je ne l'ai jamais vu fonctionner depuis que je suis ici.</w:t>
+        <w:t xml:space="preserve">La tension est au début, avec le poids. Ici on la prend à toutes — la titulaire y tient beaucoup, elle vérifie le registre. Le sucre, non : l'appareil du laboratoire ne marche pas. Il est sur l'étagère du labo. Je ne l'ai jamais vu fonctionner depuis que je suis ici.</w:t>
       </w:r>
     </w:p>
     <w:p>
@@ -21011,7 +21011,7 @@
           <w:sz w:val="20"/>
           <w:szCs w:val="20"/>
         </w:rPr>
-        <w:t xml:space="preserve">Accueil, inscription, puis la salle des constantes : poids, tension, et à la première visite la taille et le périmètre du bras. Ensuite la consultation : signes de danger, examen, hauteur utérine, bruits du cœur. Ensuite le poste des examens : bandelette urinaire, sérologies, et la glycémie quand elle est indiquée. Enfin le conseil et le rendez-vous.</w:t>
+        <w:t xml:space="preserve">Accueil, inscription, puis la salle des constantes : poids, tension, et à la première visite la taille et le périmètre du bras. Ensuite la consultation : signes de danger, examen, hauteur utérine, bruits du cœur. Ensuite le laboratoire, juste à côté, avec le bon que je remplis : sérologies, et la glycémie quand elle est indiquée ; la bandelette urinaire, nous la faisons nous-mêmes. Enfin le conseil et le rendez-vous.</w:t>
       </w:r>
     </w:p>
     <w:p>
@@ -21050,7 +21050,7 @@
           <w:sz w:val="20"/>
           <w:szCs w:val="20"/>
         </w:rPr>
-        <w:t xml:space="preserve">La tension, à toutes, aux constantes. La glycémie, au poste des examens, pour les femmes qui ont un facteur de risque : surpoids, antécédent de gros bébé ou de diabète dans la famille, sucre dans les urines, âge. Nous avons l'appareil et les bandelettes — en ce moment quarante-huit. Il y a une fiche de stock, et quand on descend sous vingt, on commande.</w:t>
+        <w:t xml:space="preserve">La tension, à toutes, aux constantes. La glycémie, au laboratoire du centre, sur un bon de la CPN, pour les femmes qui ont un facteur de risque : surpoids, antécédent de gros bébé ou de diabète dans la famille, sucre dans les urines, âge. Le laboratoire a l'appareil et les bandelettes — en ce moment quarante-huit. Il y a une fiche de stock, une part est réservée à la CPN, et quand on descend sous vingt, on commande.</w:t>
       </w:r>
     </w:p>
     <w:p>
@@ -21139,7 +21139,7 @@
           <w:sz w:val="20"/>
           <w:szCs w:val="20"/>
         </w:rPr>
-        <w:t xml:space="preserve">Le mois dernier, une femme de trente-six ans, quatrième grossesse, vingt-six semaines, en surpoids. Sucre dans les urines. J'ai fait la glycémie sur place, elle était élevée. Je l'ai référée avec la fiche. Une semaine après, le volet de retour de l'hôpital est revenu : diabète gestationnel confirmé, régime, contrôles. Elle est suivie conjointement maintenant.</w:t>
+        <w:t xml:space="preserve">Le mois dernier, une femme de trente-six ans, quatrième grossesse, vingt-six semaines, en surpoids. Sucre dans les urines. Le laboratoire a fait la glycémie le matin même, elle était élevée. Je l'ai référée avec la fiche. Une semaine après, le volet de retour de l'hôpital est revenu : diabète gestationnel confirmé, régime, contrôles. Elle est suivie conjointement maintenant.</w:t>
       </w:r>
     </w:p>
     <w:p>
@@ -22855,7 +22855,7 @@
           <w:sz w:val="20"/>
           <w:szCs w:val="20"/>
         </w:rPr>
-        <w:t xml:space="preserve">La tension au début, à toutes quand nous sommes deux. Le sucre, nous n'avons pas d'appareil. Et je vais être honnête : même si on m'en donnait un demain, je ne saurais pas à partir de quel chiffre m'inquiéter chez une femme enceinte. Je n'ai jamais été formé là-dessus.</w:t>
+        <w:t xml:space="preserve">La tension au début, à toutes quand nous sommes deux. Le sucre, le glucomètre est à la consultation des malades chroniques, le jeudi ; pour la CPN, on ne s'en sert pas. Et je vais être honnête : même si on me le prêtait demain, je ne saurais pas à partir de quel chiffre m'inquiéter chez une femme enceinte. Je n'ai jamais été formé là-dessus.</w:t>
       </w:r>
     </w:p>
     <w:p>
@@ -23226,7 +23226,7 @@
           <w:sz w:val="20"/>
           <w:szCs w:val="20"/>
         </w:rPr>
-        <w:t xml:space="preserve">Les jours où je suis appelé ailleurs et où ma collègue fait tout seule. La tension est prise, je crois, mais l'explication est réduite au minimum. Et pour le sucre, c'est tous les jours, puisqu'on ne peut pas.</w:t>
+        <w:t xml:space="preserve">Les jours où je suis appelé ailleurs et où ma collègue fait tout seule. La tension est prise, je crois, mais l'explication est réduite au minimum. Et pour le sucre, c'est tous les jours, puisqu'on ne le fait pas.</w:t>
       </w:r>
     </w:p>
     <w:p>
@@ -24460,7 +24460,7 @@
           <w:sz w:val="20"/>
           <w:szCs w:val="20"/>
         </w:rPr>
-        <w:t xml:space="preserve">La tension, à toutes. Le sucre… c'est une histoire. Nous avons un glucomètre qui marche. Nous avons des bandelettes — trente. Mais elles sont périmées depuis mai. Alors je ne peux pas les utiliser. L'appareil est là, les bandelettes sont là, et je ne fais pas le test.</w:t>
+        <w:t xml:space="preserve">La tension, à toutes. Le sucre… c'est une histoire. Le laboratoire a un glucomètre qui marche. Il a des bandelettes — trente. Mais elles sont périmées depuis mai. Alors je ne peux pas les utiliser. L'appareil est là, les bandelettes sont là, et je ne fais pas le test.</w:t>
       </w:r>
     </w:p>
     <w:p>
@@ -26265,7 +26265,7 @@
           <w:sz w:val="20"/>
           <w:szCs w:val="20"/>
         </w:rPr>
-        <w:t xml:space="preserve">La tension aux constantes, c'est souvent le stagiaire qui la prend. Le sucre, nous avons l'appareil et quelques bandelettes, cinq je crois. Je ne sais pas toujours à qui le faire. Les collègues qui sont partis savaient ; moi j'ai appris en les regardant, pendant deux mois.</w:t>
+        <w:t xml:space="preserve">La tension aux constantes, c'est souvent le stagiaire qui la prend. Le sucre, c'est au laboratoire : ils ont l'appareil et quelques bandelettes, cinq je crois. Je ne sais pas toujours à qui le faire. Les collègues qui sont partis savaient ; moi j'ai appris en les regardant, pendant deux mois.</w:t>
       </w:r>
     </w:p>
     <w:p>
@@ -27970,7 +27970,7 @@
           <w:sz w:val="20"/>
           <w:szCs w:val="20"/>
         </w:rPr>
-        <w:t xml:space="preserve">La tension, à toutes. Le sucre, pas d'appareil. Quand je soupçonne quelque chose, je réfère pour une glycémie et je demande à l'agent de santé communautaire du village de vérifier qu'elle y est allée.</w:t>
+        <w:t xml:space="preserve">La tension, à toutes. Le sucre, le glucomètre du laboratoire est en panne depuis l'an dernier. Quand je soupçonne quelque chose, je réfère pour une glycémie et je demande à l'agent de santé communautaire du village de vérifier qu'elle y est allée.</w:t>
       </w:r>
     </w:p>
     <w:p>
@@ -28441,7 +28441,7 @@
           <w:sz w:val="20"/>
           <w:szCs w:val="20"/>
         </w:rPr>
-        <w:t xml:space="preserve">Pour le sucre, toujours, puisque nous n'avons pas d'appareil. Et quand l'agent du village n'est pas actif — tous ne le sont pas — je perds la trace des femmes que j'ai référées.</w:t>
+        <w:t xml:space="preserve">Pour le sucre, toujours, puisque l'appareil du laboratoire est en panne. Et quand l'agent du village n'est pas actif — tous ne le sont pas — je perds la trace des femmes que j'ai référées.</w:t>
       </w:r>
     </w:p>
     <w:p>
@@ -29775,7 +29775,7 @@
           <w:sz w:val="20"/>
           <w:szCs w:val="20"/>
         </w:rPr>
-        <w:t xml:space="preserve">La tension, avec l'appareil neuf, à toutes. Le sucre, le glucomètre est prévu dans la dotation, mais il n'est pas arrivé. Les bandelettes urinaires non plus.</w:t>
+        <w:t xml:space="preserve">La tension, avec l'appareil neuf, à toutes. Le sucre, le glucomètre est prévu dans la dotation du laboratoire, mais il n'est pas arrivé. Les bandelettes urinaires non plus.</w:t>
       </w:r>
     </w:p>
     <w:p>
@@ -31441,7 +31441,7 @@
           <w:sz w:val="20"/>
           <w:szCs w:val="20"/>
         </w:rPr>
-        <w:t xml:space="preserve">Inscription, poids, tension, examen, glycémie quand il y a un facteur de risque, bandelette urinaire, médicaments, conseils, rendez-vous.</w:t>
+        <w:t xml:space="preserve">Inscription, poids, tension, examen, bon pour la glycémie au laboratoire quand il y a un facteur de risque, bandelette urinaire, médicaments, conseils, rendez-vous.</w:t>
       </w:r>
     </w:p>
     <w:p>
@@ -31480,7 +31480,7 @@
           <w:sz w:val="20"/>
           <w:szCs w:val="20"/>
         </w:rPr>
-        <w:t xml:space="preserve">La tension à toutes. La glycémie aux femmes à risque — nous avons l'appareil et des bandelettes, quatorze en ce moment. Depuis la formation, je la fais selon les critères : surpoids, antécédent, âge, sucre dans les urines.</w:t>
+        <w:t xml:space="preserve">La tension à toutes. La glycémie aux femmes à risque — le laboratoire a l'appareil et des bandelettes, quatorze en ce moment ; j'écris le bon et la femme y passe avant de repartir. Depuis la formation, je la fais selon les critères : surpoids, antécédent, âge, sucre dans les urines.</w:t>
       </w:r>
     </w:p>
     <w:p>
@@ -31862,7 +31862,7 @@
           <w:sz w:val="20"/>
           <w:szCs w:val="20"/>
         </w:rPr>
-        <w:t xml:space="preserve">La formation récente, l'appareil et les bandelettes. Ici nous avons ce qu'il faut pour le test.</w:t>
+        <w:t xml:space="preserve">La formation récente, l'appareil et les bandelettes. Ici le laboratoire a ce qu'il faut pour le test, et il accepte nos bons.</w:t>
       </w:r>
     </w:p>
     <w:p>
@@ -33196,7 +33196,7 @@
           <w:sz w:val="20"/>
           <w:szCs w:val="20"/>
         </w:rPr>
-        <w:t xml:space="preserve">Inscription, poids, tension, examen, glycémie si indiquée et si nous avons les bandelettes, bandelette urinaire, médicaments, rendez-vous.</w:t>
+        <w:t xml:space="preserve">Inscription, poids, tension, examen, glycémie au laboratoire si indiquée et si le labo a des bandelettes, bandelette urinaire, médicaments, rendez-vous.</w:t>
       </w:r>
     </w:p>
     <w:p>
@@ -33235,7 +33235,7 @@
           <w:sz w:val="20"/>
           <w:szCs w:val="20"/>
         </w:rPr>
-        <w:t xml:space="preserve">La tension à toutes. La glycémie aux femmes à risque — mais nous sommes en rupture de bandelettes depuis deux mois. Vous le verrez dans le registre : la colonne est remplie jusqu'à fin juillet, puis vide.</w:t>
+        <w:t xml:space="preserve">La tension à toutes. La glycémie aux femmes à risque — mais le laboratoire est en rupture de bandelettes depuis deux mois. Vous le verrez dans le registre : la colonne est remplie jusqu'à fin juillet, puis vide.</w:t>
       </w:r>
     </w:p>
     <w:p>
@@ -35040,7 +35040,7 @@
           <w:sz w:val="20"/>
           <w:szCs w:val="20"/>
         </w:rPr>
-        <w:t xml:space="preserve">La tension, normalement à toutes. Le sucre, nous avons l'appareil et quelques bandelettes, que je réserve aux cas évidents.</w:t>
+        <w:t xml:space="preserve">La tension, normalement à toutes. Le sucre, le laboratoire a l'appareil et quelques bandelettes ; je ne fais le bon que pour les cas évidents.</w:t>
       </w:r>
     </w:p>
     <w:p>
@@ -36745,7 +36745,7 @@
           <w:sz w:val="20"/>
           <w:szCs w:val="20"/>
         </w:rPr>
-        <w:t xml:space="preserve">La tension, avec ce vieil appareil — regardez, la poire est réparée avec du ruban. Il marche, mais il faut s'y reprendre à deux ou trois fois. Le sucre, nous n'avons jamais eu d'appareil ici. Jamais.</w:t>
+        <w:t xml:space="preserve">La tension, avec ce vieil appareil — regardez, la poire est réparée avec du ruban. Il marche, mais il faut s'y reprendre à deux ou trois fois. Le sucre, il y a un appareil au laboratoire, pour les malades chroniques. Pour les femmes enceintes, on ne l'a jamais fait. Jamais.</w:t>
       </w:r>
     </w:p>
     <w:p>
@@ -38450,7 +38450,7 @@
           <w:sz w:val="20"/>
           <w:szCs w:val="20"/>
         </w:rPr>
-        <w:t xml:space="preserve">La tension à toutes, avec l'appareil à piles — quand il y a des piles. Il y a des semaines où il n'y en a pas, alors j'en achète moi-même au marché, parce qu'on ne peut pas faire de CPN sans tension. Le sucre, pas d'appareil.</w:t>
+        <w:t xml:space="preserve">La tension à toutes, avec l'appareil à piles — quand il y a des piles. Il y a des semaines où il n'y en a pas, alors j'en achète moi-même au marché, parce qu'on ne peut pas faire de CPN sans tension. Le sucre, le glucomètre du laboratoire n'a pas de bandelettes en ce moment, et le technicien ne vient que deux jours par semaine.</w:t>
       </w:r>
     </w:p>
     <w:p>
@@ -39233,7 +39233,7 @@
           <w:sz w:val="20"/>
           <w:szCs w:val="20"/>
         </w:rPr>
-        <w:t xml:space="preserve">Des piles dans les commandes — ça paraît petit, mais c'est la tension de toutes les femmes. Un glucomètre pour les centres éloignés. Et un outil officiel de suivi après l'accouchement.</w:t>
+        <w:t xml:space="preserve">Des piles dans les commandes — ça paraît petit, mais c'est la tension de toutes les femmes. Des bandelettes pour les laboratoires des centres éloignés. Et un outil officiel de suivi après l'accouchement.</w:t>
       </w:r>
     </w:p>
     <w:p>

</xml_diff>